<commit_message>
rs_differences in geofit and psg_geomodels_fit
</commit_message>
<xml_diff>
--- a/rs_vs_psg_notes.docx
+++ b/rs_vs_psg_notes.docx
@@ -21,23 +21,7 @@
     </w:p>
     <w:p>
       <w:r>
-        <w:t>Coordinate file names should be [type]_coords_[</w:t>
-      </w:r>
-      <w:proofErr w:type="spellStart"/>
-      <w:r>
-        <w:t>subjid</w:t>
-      </w:r>
-      <w:proofErr w:type="spellEnd"/>
-      <w:r>
-        <w:t>]_</w:t>
-      </w:r>
-      <w:proofErr w:type="spellStart"/>
-      <w:r>
-        <w:t>extra.mat</w:t>
-      </w:r>
-      <w:proofErr w:type="spellEnd"/>
-      <w:r>
-        <w:t xml:space="preserve">, e.g., </w:t>
+        <w:t xml:space="preserve">Coordinate file names should be [type]_coords_[subjid]_extra.mat, e.g., </w:t>
       </w:r>
       <w:r>
         <w:t>dgea3pt_coords_BL_MC_NF_SN_ZK_sess01_10</w:t>
@@ -56,257 +40,108 @@
         <w:t>hlid_odor17_coords_2023-04-22-03</w:t>
       </w:r>
       <w:r>
-        <w:t xml:space="preserve">.mat; parsed by </w:t>
-      </w:r>
-      <w:proofErr w:type="spellStart"/>
-      <w:r>
-        <w:t>psg_parse_filename</w:t>
-      </w:r>
-      <w:proofErr w:type="spellEnd"/>
-    </w:p>
-    <w:p>
-      <w:r>
-        <w:t xml:space="preserve">In coords file, the field </w:t>
-      </w:r>
-      <w:proofErr w:type="spellStart"/>
-      <w:r>
-        <w:t>stim_labels</w:t>
-      </w:r>
-      <w:proofErr w:type="spellEnd"/>
-      <w:r>
-        <w:t xml:space="preserve"> should always be a character array, each row is a stimulus label, can be created by </w:t>
-      </w:r>
-      <w:proofErr w:type="gramStart"/>
-      <w:r>
-        <w:t>an</w:t>
-      </w:r>
-      <w:proofErr w:type="gramEnd"/>
+        <w:t>.mat; parsed by psg_parse_filename</w:t>
+      </w:r>
+    </w:p>
+    <w:p>
+      <w:r>
+        <w:t>In coords file, the field stim_labels should always be a character array, each row is a stimulus label, can be created by an strvcat</w:t>
+      </w:r>
+    </w:p>
+    <w:p>
+      <w:pPr>
+        <w:pStyle w:val="Heading2"/>
+      </w:pPr>
+      <w:r>
+        <w:t>Internal structure</w:t>
+      </w:r>
+    </w:p>
+    <w:p>
+      <w:r>
+        <w:t>data.ds{</w:t>
+      </w:r>
+      <w:r>
+        <w:t>1,</w:t>
+      </w:r>
+      <w:r>
+        <w:t>:}:  coordinates</w:t>
+      </w:r>
+    </w:p>
+    <w:p>
+      <w:r>
+        <w:t>data.sas{</w:t>
+      </w:r>
+      <w:r>
+        <w:t>1,</w:t>
+      </w:r>
+      <w:r>
+        <w:t>:}: metadata, including  sa.</w:t>
+      </w:r>
+      <w:r>
+        <w:t>t</w:t>
+      </w:r>
+      <w:r>
+        <w:t>ypenames</w:t>
+      </w:r>
+      <w:r>
+        <w:t>; this should always be a cell array</w:t>
+      </w:r>
+    </w:p>
+    <w:p/>
+    <w:p>
+      <w:r>
+        <w:t>notional coordinates are looked for in type_coords, then btc_specoords, then btc_augcoords; can be empty (but then rs_findrays will return empty and rs_disp_enh_* will not be useful</w:t>
+      </w:r>
+    </w:p>
+    <w:p>
+      <w:r>
+        <w:t>This is searched in psg_</w:t>
+      </w:r>
+      <w:r>
+        <w:t>align_coordsets, rs_findrays, based on opts.coord_fields, as set in psg_defopts.</w:t>
+      </w:r>
+    </w:p>
+    <w:p>
       <w:r>
         <w:t xml:space="preserve"> </w:t>
       </w:r>
-      <w:proofErr w:type="spellStart"/>
-      <w:r>
-        <w:t>strvcat</w:t>
-      </w:r>
-      <w:proofErr w:type="spellEnd"/>
+    </w:p>
+    <w:p>
+      <w:r>
+        <w:t>data.sets{</w:t>
+      </w:r>
+      <w:r>
+        <w:t>1,</w:t>
+      </w:r>
+      <w:r>
+        <w:t>:}:  should always include type, label, dim_list fields</w:t>
+      </w:r>
+      <w:r>
+        <w:t xml:space="preserve">; see </w:t>
+      </w:r>
+      <w:r>
+        <w:t>psg_make_setstruct</w:t>
+      </w:r>
+      <w:r>
+        <w:t>.m</w:t>
+      </w:r>
+    </w:p>
+    <w:p>
+      <w:r>
+        <w:t>sets{}.dim_list must be unique and ascending, and dimensions of data.ds{k} must be nstims x k</w:t>
+      </w:r>
     </w:p>
     <w:p>
       <w:pPr>
         <w:pStyle w:val="Heading2"/>
       </w:pPr>
       <w:r>
-        <w:t>Internal structure</w:t>
-      </w:r>
-    </w:p>
-    <w:p>
-      <w:r>
-        <w:t>data.ds{</w:t>
-      </w:r>
-      <w:proofErr w:type="gramStart"/>
-      <w:r>
-        <w:t>1,</w:t>
-      </w:r>
-      <w:r>
-        <w:t>:</w:t>
-      </w:r>
-      <w:proofErr w:type="gramEnd"/>
-      <w:r>
-        <w:t>}:  coordinates</w:t>
-      </w:r>
-    </w:p>
-    <w:p>
-      <w:proofErr w:type="spellStart"/>
-      <w:r>
-        <w:t>data.sas</w:t>
-      </w:r>
-      <w:proofErr w:type="spellEnd"/>
-      <w:r>
-        <w:t>{</w:t>
-      </w:r>
-      <w:proofErr w:type="gramStart"/>
-      <w:r>
-        <w:t>1,</w:t>
-      </w:r>
-      <w:r>
-        <w:t>:</w:t>
-      </w:r>
-      <w:proofErr w:type="gramEnd"/>
-      <w:r>
-        <w:t xml:space="preserve">}: metadata, including  </w:t>
-      </w:r>
-      <w:proofErr w:type="spellStart"/>
-      <w:r>
-        <w:t>sa.</w:t>
-      </w:r>
-      <w:r>
-        <w:t>t</w:t>
-      </w:r>
-      <w:r>
-        <w:t>ypenames</w:t>
-      </w:r>
-      <w:proofErr w:type="spellEnd"/>
-      <w:r>
-        <w:t>; this should always be a cell array</w:t>
-      </w:r>
-    </w:p>
-    <w:p/>
-    <w:p>
-      <w:r>
-        <w:t xml:space="preserve">notional coordinates are looked for in </w:t>
-      </w:r>
-      <w:proofErr w:type="spellStart"/>
-      <w:r>
-        <w:t>type_coords</w:t>
-      </w:r>
-      <w:proofErr w:type="spellEnd"/>
-      <w:r>
-        <w:t xml:space="preserve">, then </w:t>
-      </w:r>
-      <w:proofErr w:type="spellStart"/>
-      <w:r>
-        <w:t>btc_specoords</w:t>
-      </w:r>
-      <w:proofErr w:type="spellEnd"/>
-      <w:r>
-        <w:t xml:space="preserve">, then </w:t>
-      </w:r>
-      <w:proofErr w:type="spellStart"/>
-      <w:r>
-        <w:t>btc_augcoords</w:t>
-      </w:r>
-      <w:proofErr w:type="spellEnd"/>
-      <w:r>
-        <w:t xml:space="preserve">; can be empty (but then </w:t>
-      </w:r>
-      <w:proofErr w:type="spellStart"/>
-      <w:r>
-        <w:t>rs_findrays</w:t>
-      </w:r>
-      <w:proofErr w:type="spellEnd"/>
-      <w:r>
-        <w:t xml:space="preserve"> will return empty and </w:t>
-      </w:r>
-      <w:proofErr w:type="spellStart"/>
-      <w:r>
-        <w:t>rs_disp_enh</w:t>
-      </w:r>
-      <w:proofErr w:type="spellEnd"/>
-      <w:r>
-        <w:t>_* will not be useful</w:t>
-      </w:r>
-    </w:p>
-    <w:p>
-      <w:r>
-        <w:t xml:space="preserve">This is searched </w:t>
-      </w:r>
-      <w:proofErr w:type="gramStart"/>
-      <w:r>
-        <w:t>in</w:t>
-      </w:r>
-      <w:proofErr w:type="gramEnd"/>
-      <w:r>
-        <w:t xml:space="preserve"> </w:t>
-      </w:r>
-      <w:proofErr w:type="spellStart"/>
-      <w:r>
-        <w:t>psg_</w:t>
-      </w:r>
-      <w:r>
-        <w:t>align_coordsets</w:t>
-      </w:r>
-      <w:proofErr w:type="spellEnd"/>
-      <w:r>
-        <w:t xml:space="preserve">, </w:t>
-      </w:r>
-      <w:proofErr w:type="spellStart"/>
-      <w:r>
-        <w:t>rs_findrays</w:t>
-      </w:r>
-      <w:proofErr w:type="spellEnd"/>
-      <w:r>
-        <w:t xml:space="preserve">, based on </w:t>
-      </w:r>
-      <w:proofErr w:type="spellStart"/>
-      <w:r>
-        <w:t>opts.coord_fields</w:t>
-      </w:r>
-      <w:proofErr w:type="spellEnd"/>
-      <w:r>
-        <w:t xml:space="preserve">, as set in </w:t>
-      </w:r>
-      <w:proofErr w:type="spellStart"/>
-      <w:r>
-        <w:t>psg_defopts</w:t>
-      </w:r>
-      <w:proofErr w:type="spellEnd"/>
-      <w:r>
-        <w:t>.</w:t>
-      </w:r>
-    </w:p>
-    <w:p>
-      <w:r>
-        <w:t xml:space="preserve"> </w:t>
-      </w:r>
-    </w:p>
-    <w:p>
-      <w:proofErr w:type="spellStart"/>
-      <w:r>
-        <w:t>data.sets</w:t>
-      </w:r>
-      <w:proofErr w:type="spellEnd"/>
-      <w:r>
-        <w:t>{</w:t>
-      </w:r>
-      <w:proofErr w:type="gramStart"/>
-      <w:r>
-        <w:t>1,</w:t>
-      </w:r>
-      <w:r>
-        <w:t>:</w:t>
-      </w:r>
-      <w:proofErr w:type="gramEnd"/>
-      <w:r>
-        <w:t xml:space="preserve">}:  should always include type, label, </w:t>
-      </w:r>
-      <w:proofErr w:type="spellStart"/>
-      <w:r>
-        <w:t>dim_list</w:t>
-      </w:r>
-      <w:proofErr w:type="spellEnd"/>
-      <w:r>
-        <w:t xml:space="preserve"> fields</w:t>
-      </w:r>
-      <w:r>
-        <w:t xml:space="preserve">; see </w:t>
-      </w:r>
-      <w:proofErr w:type="spellStart"/>
-      <w:r>
-        <w:t>psg_make_setstruct</w:t>
-      </w:r>
-      <w:r>
-        <w:t>.m</w:t>
-      </w:r>
-      <w:proofErr w:type="spellEnd"/>
-    </w:p>
-    <w:p>
-      <w:r>
-        <w:t>sets{}.</w:t>
-      </w:r>
-      <w:proofErr w:type="spellStart"/>
-      <w:r>
-        <w:t>dim_list</w:t>
-      </w:r>
-      <w:proofErr w:type="spellEnd"/>
-      <w:r>
-        <w:t xml:space="preserve"> must be unique and ascending, and dimensions of data.ds{k} must be </w:t>
-      </w:r>
-      <w:proofErr w:type="spellStart"/>
-      <w:r>
-        <w:t>nstims</w:t>
-      </w:r>
-      <w:proofErr w:type="spellEnd"/>
-      <w:r>
-        <w:t xml:space="preserve"> x k</w:t>
+        <w:t>Alignment</w:t>
+      </w:r>
+    </w:p>
+    <w:p>
+      <w:r>
+        <w:t>This adjust the order of stimuli within a data file and insert NaN’s so that datasets with non-overlapping stimuli now have coordinates that line up</w:t>
       </w:r>
     </w:p>
     <w:p>
@@ -314,27 +149,6 @@
         <w:pStyle w:val="Heading2"/>
       </w:pPr>
       <w:r>
-        <w:t>Alignment</w:t>
-      </w:r>
-    </w:p>
-    <w:p>
-      <w:r>
-        <w:t xml:space="preserve">This adjust the order of stimuli within a data file and insert </w:t>
-      </w:r>
-      <w:proofErr w:type="spellStart"/>
-      <w:r>
-        <w:t>NaN’s</w:t>
-      </w:r>
-      <w:proofErr w:type="spellEnd"/>
-      <w:r>
-        <w:t xml:space="preserve"> so that datasets with non-overlapping stimuli now have coordinates that line up</w:t>
-      </w:r>
-    </w:p>
-    <w:p>
-      <w:pPr>
-        <w:pStyle w:val="Heading2"/>
-      </w:pPr>
-      <w:r>
         <w:t>Knitting</w:t>
       </w:r>
     </w:p>
@@ -352,59 +166,20 @@
       </w:r>
     </w:p>
     <w:p>
-      <w:proofErr w:type="spellStart"/>
-      <w:r>
-        <w:t>rs</w:t>
-      </w:r>
-      <w:proofErr w:type="spellEnd"/>
-      <w:r>
-        <w:t>: main routines</w:t>
-      </w:r>
-    </w:p>
-    <w:p>
-      <w:proofErr w:type="spellStart"/>
-      <w:r>
-        <w:t>psg</w:t>
-      </w:r>
-      <w:proofErr w:type="spellEnd"/>
-      <w:r>
-        <w:t xml:space="preserve">:  back-end, </w:t>
+      <w:r>
+        <w:t>rs: main routines</w:t>
+      </w:r>
+    </w:p>
+    <w:p>
+      <w:r>
+        <w:t xml:space="preserve">psg:  back-end, </w:t>
       </w:r>
       <w:r>
         <w:t>original developer’s software,</w:t>
       </w:r>
       <w:r>
-        <w:t xml:space="preserve">  </w:t>
-      </w:r>
-      <w:proofErr w:type="spellStart"/>
-      <w:r>
-        <w:t>rs</w:t>
-      </w:r>
-      <w:proofErr w:type="spellEnd"/>
-      <w:r>
-        <w:t xml:space="preserve"> can call </w:t>
-      </w:r>
-      <w:proofErr w:type="spellStart"/>
-      <w:r>
-        <w:t>psg</w:t>
-      </w:r>
-      <w:proofErr w:type="spellEnd"/>
-      <w:r>
-        <w:t xml:space="preserve"> but </w:t>
-      </w:r>
-      <w:proofErr w:type="spellStart"/>
-      <w:r>
-        <w:t>psg</w:t>
-      </w:r>
-      <w:proofErr w:type="spellEnd"/>
-      <w:r>
-        <w:t xml:space="preserve"> cannot call </w:t>
-      </w:r>
-      <w:proofErr w:type="spellStart"/>
-      <w:r>
-        <w:t>rs</w:t>
-      </w:r>
-      <w:proofErr w:type="spellEnd"/>
+        <w:t xml:space="preserve">  rs can call psg but psg cannot call rs</w:t>
+      </w:r>
     </w:p>
     <w:p>
       <w:r>
@@ -414,33 +189,12 @@
         <w:t xml:space="preserve">developer’s </w:t>
       </w:r>
       <w:r>
-        <w:t xml:space="preserve">math directory, needed for </w:t>
-      </w:r>
-      <w:proofErr w:type="spellStart"/>
-      <w:r>
-        <w:t>psg</w:t>
-      </w:r>
-      <w:proofErr w:type="spellEnd"/>
-      <w:r>
-        <w:t xml:space="preserve"> or </w:t>
-      </w:r>
-      <w:proofErr w:type="spellStart"/>
-      <w:r>
-        <w:t>rs</w:t>
-      </w:r>
-      <w:proofErr w:type="spellEnd"/>
-    </w:p>
-    <w:p>
-      <w:r>
-        <w:t>octave-</w:t>
-      </w:r>
-      <w:proofErr w:type="spellStart"/>
-      <w:r>
-        <w:t>compat</w:t>
-      </w:r>
-      <w:proofErr w:type="spellEnd"/>
-      <w:r>
-        <w:t>: files needed for compatibility with Octave</w:t>
+        <w:t>math directory, needed for psg or rs</w:t>
+      </w:r>
+    </w:p>
+    <w:p>
+      <w:r>
+        <w:t>octave-compat: files needed for compatibility with Octave</w:t>
       </w:r>
     </w:p>
     <w:p>
@@ -468,21 +222,8 @@
       </w:r>
     </w:p>
     <w:p>
-      <w:proofErr w:type="spellStart"/>
-      <w:r>
-        <w:t>svd_issue</w:t>
-      </w:r>
-      <w:proofErr w:type="spellEnd"/>
-      <w:r>
-        <w:t xml:space="preserve">: details of the inconsistencies of </w:t>
-      </w:r>
-      <w:proofErr w:type="spellStart"/>
-      <w:r>
-        <w:t>svd.m</w:t>
-      </w:r>
-      <w:proofErr w:type="spellEnd"/>
-      <w:r>
-        <w:t xml:space="preserve"> and related</w:t>
+      <w:r>
+        <w:t>svd_issue: details of the inconsistencies of svd.m and related</w:t>
       </w:r>
     </w:p>
     <w:p>
@@ -490,49 +231,15 @@
         <w:pStyle w:val="Heading1"/>
       </w:pPr>
       <w:r>
-        <w:t xml:space="preserve">Functional differences between </w:t>
-      </w:r>
-      <w:proofErr w:type="spellStart"/>
-      <w:r>
-        <w:t>rs</w:t>
-      </w:r>
-      <w:proofErr w:type="spellEnd"/>
-      <w:r>
-        <w:t xml:space="preserve"> and </w:t>
-      </w:r>
-      <w:proofErr w:type="spellStart"/>
-      <w:r>
-        <w:t>psg</w:t>
-      </w:r>
-      <w:proofErr w:type="spellEnd"/>
-    </w:p>
-    <w:p>
-      <w:proofErr w:type="spellStart"/>
-      <w:r>
-        <w:t>rs_read_coordsets</w:t>
-      </w:r>
-      <w:proofErr w:type="spellEnd"/>
-      <w:r>
-        <w:t xml:space="preserve"> can work as a standalone</w:t>
-      </w:r>
-      <w:r>
-        <w:t xml:space="preserve"> for reading data files (</w:t>
-      </w:r>
-      <w:proofErr w:type="spellStart"/>
-      <w:r>
-        <w:t>psg_read_coordsets</w:t>
-      </w:r>
-      <w:proofErr w:type="spellEnd"/>
-      <w:r>
-        <w:t xml:space="preserve"> is intended to be called from </w:t>
-      </w:r>
-      <w:proofErr w:type="spellStart"/>
-      <w:r>
-        <w:t>psg_get_coorddata</w:t>
-      </w:r>
-      <w:proofErr w:type="spellEnd"/>
-      <w:r>
-        <w:t>)</w:t>
+        <w:t>Functional differences between rs and psg</w:t>
+      </w:r>
+    </w:p>
+    <w:p>
+      <w:r>
+        <w:t>rs_read_coordsets can work as a standalone</w:t>
+      </w:r>
+      <w:r>
+        <w:t xml:space="preserve"> for reading data files (psg_read_coordsets is intended to be called from psg_get_coorddata)</w:t>
       </w:r>
     </w:p>
     <w:p>
@@ -553,19 +260,12 @@
       <w:r>
         <w:t xml:space="preserve">When datasets are knitted (i.e., Procrustes-consensus, after missing data), there is no attempt to merge the ray structures from the components; rather, it is re-created by </w:t>
       </w:r>
-      <w:proofErr w:type="spellStart"/>
-      <w:r>
-        <w:t>rs_findrays</w:t>
-      </w:r>
-      <w:proofErr w:type="spellEnd"/>
-      <w:r>
-        <w:t xml:space="preserve"> (which calls </w:t>
-      </w:r>
-      <w:proofErr w:type="spellStart"/>
+      <w:r>
+        <w:t xml:space="preserve">rs_findrays (which calls </w:t>
+      </w:r>
       <w:r>
         <w:t>psg_findrays</w:t>
       </w:r>
-      <w:proofErr w:type="spellEnd"/>
       <w:r>
         <w:t>)</w:t>
       </w:r>
@@ -601,31 +301,37 @@
       </w:r>
     </w:p>
     <w:p>
-      <w:proofErr w:type="spellStart"/>
-      <w:r>
-        <w:t>pipeline.sets</w:t>
-      </w:r>
-      <w:proofErr w:type="spellEnd"/>
-      <w:r>
-        <w:t xml:space="preserve"> is a cell array (typically length 1) of the metadata of the coordinate sets that are directly used – e.g., transformed by a model, or aligned by filling in stimuli and </w:t>
-      </w:r>
-      <w:proofErr w:type="spellStart"/>
-      <w:r>
-        <w:t>NaN’s</w:t>
-      </w:r>
-      <w:proofErr w:type="spellEnd"/>
-      <w:r>
-        <w:t>, or rotated to a consensus</w:t>
-      </w:r>
-    </w:p>
-    <w:p>
-      <w:proofErr w:type="spellStart"/>
-      <w:r>
-        <w:t>pipeline.sets_combined</w:t>
-      </w:r>
-      <w:proofErr w:type="spellEnd"/>
-      <w:r>
-        <w:t xml:space="preserve"> is a cell array of the metadata of datasets that are combined, e.g., used to form a consensus, or to align</w:t>
+      <w:r>
+        <w:t>pipeline.sets is a cell array (typically length 1) of the metadata of the coordinate sets that are directly used – e.g., transformed by a model, or aligned by filling in stimuli and NaN’s, or rotated to a consensus</w:t>
+      </w:r>
+    </w:p>
+    <w:p>
+      <w:r>
+        <w:t>pipeline.sets_combined is a cell array of the metadata of datasets that are combined, e.g., used to form a consensus, or to align</w:t>
+      </w:r>
+    </w:p>
+    <w:p>
+      <w:pPr>
+        <w:pStyle w:val="Heading3"/>
+      </w:pPr>
+      <w:r>
+        <w:t>Fitting geometric models</w:t>
+      </w:r>
+    </w:p>
+    <w:p>
+      <w:r>
+        <w:t>rs_geofit calls psg_geomodels_fit.  This is the functional version of psg_geomodels_run, but also allows for an arbitrary choice of pairings of input (adj) and output (ref) dimensions.  This leads to a different (but upwardly compatible indexing scheme in the results structure for nesting by dimension, since the length of the list of dimensions is not necessarily equal to the maximal dimension tested.</w:t>
+      </w:r>
+    </w:p>
+    <w:p>
+      <w:r>
+        <w:t xml:space="preserve">Also, rs_geofit.m reorders the models in the model definition </w:t>
+      </w:r>
+      <w:r>
+        <w:t>model_types_def.model_types</w:t>
+      </w:r>
+      <w:r>
+        <w:t xml:space="preserve"> via rs_geofit.getmodels.m (this is a good idea, models are ranked so that simple models precede more complex ones).  This reordering needs to be taken into account when comparing the results structure outputs of rs_geofit and psg_geomodels_fit.  See psg_geomodels_fit_test3.[m,mat,txt]</w:t>
       </w:r>
     </w:p>
     <w:p>
@@ -637,213 +343,46 @@
       </w:r>
     </w:p>
     <w:p>
-      <w:proofErr w:type="spellStart"/>
       <w:r>
         <w:t>r</w:t>
       </w:r>
       <w:r>
-        <w:t>s_disp_coordsets</w:t>
-      </w:r>
-      <w:proofErr w:type="spellEnd"/>
-      <w:r>
-        <w:t xml:space="preserve"> replaces functionality of </w:t>
-      </w:r>
-      <w:proofErr w:type="spellStart"/>
-      <w:r>
-        <w:t>psg_visualize</w:t>
-      </w:r>
-      <w:proofErr w:type="spellEnd"/>
-      <w:r>
-        <w:t xml:space="preserve">*, which </w:t>
-      </w:r>
-      <w:proofErr w:type="gramStart"/>
-      <w:r>
-        <w:t>calls</w:t>
-      </w:r>
-      <w:proofErr w:type="gramEnd"/>
-      <w:r>
-        <w:t xml:space="preserve"> </w:t>
-      </w:r>
-      <w:proofErr w:type="spellStart"/>
-      <w:r>
-        <w:t>psg_plotcoords</w:t>
-      </w:r>
-      <w:proofErr w:type="spellEnd"/>
-      <w:r>
-        <w:t xml:space="preserve">*.  Different strategy:  </w:t>
-      </w:r>
-      <w:proofErr w:type="spellStart"/>
-      <w:r>
-        <w:t>rs_disp_coordsets</w:t>
-      </w:r>
-      <w:proofErr w:type="spellEnd"/>
-      <w:r>
-        <w:t xml:space="preserve"> does not carry out any internal transformations; this should be done by </w:t>
-      </w:r>
-      <w:proofErr w:type="spellStart"/>
-      <w:r>
-        <w:t>rs_xform_apply</w:t>
-      </w:r>
-      <w:proofErr w:type="spellEnd"/>
-      <w:r>
-        <w:t xml:space="preserve"> or similar.</w:t>
-      </w:r>
-    </w:p>
-    <w:p>
-      <w:r>
-        <w:t xml:space="preserve">The options in </w:t>
-      </w:r>
-      <w:proofErr w:type="spellStart"/>
-      <w:r>
-        <w:t>psg_visualize</w:t>
-      </w:r>
-      <w:proofErr w:type="spellEnd"/>
-      <w:r>
-        <w:t xml:space="preserve"> have </w:t>
-      </w:r>
-      <w:proofErr w:type="gramStart"/>
-      <w:r>
-        <w:t>a</w:t>
-      </w:r>
-      <w:proofErr w:type="gramEnd"/>
-      <w:r>
-        <w:t xml:space="preserve"> correspondence to those in </w:t>
-      </w:r>
-      <w:proofErr w:type="spellStart"/>
-      <w:r>
-        <w:t>aux.opts_disp</w:t>
-      </w:r>
-      <w:proofErr w:type="spellEnd"/>
-      <w:r>
-        <w:t>:</w:t>
-      </w:r>
-    </w:p>
-    <w:p>
-      <w:proofErr w:type="spellStart"/>
-      <w:r>
-        <w:t>opts_vis.model_dim</w:t>
-      </w:r>
-      <w:proofErr w:type="spellEnd"/>
-      <w:r>
-        <w:t xml:space="preserve"> -&gt; </w:t>
-      </w:r>
-      <w:proofErr w:type="spellStart"/>
-      <w:r>
-        <w:t>dim_select</w:t>
-      </w:r>
-      <w:proofErr w:type="spellEnd"/>
-    </w:p>
-    <w:p>
-      <w:proofErr w:type="spellStart"/>
-      <w:r>
-        <w:t>opts_vis.which_dimcombs</w:t>
-      </w:r>
-      <w:proofErr w:type="spellEnd"/>
-      <w:r>
-        <w:t xml:space="preserve"> -&gt; </w:t>
-      </w:r>
-      <w:proofErr w:type="spellStart"/>
-      <w:r>
-        <w:t>coord_group_method</w:t>
-      </w:r>
-      <w:proofErr w:type="spellEnd"/>
-      <w:r>
-        <w:t>,</w:t>
-      </w:r>
-      <w:r>
-        <w:t xml:space="preserve"> and same options are available: 'all' (default),  '</w:t>
-      </w:r>
-      <w:proofErr w:type="spellStart"/>
-      <w:r>
-        <w:t>keeplow</w:t>
-      </w:r>
-      <w:proofErr w:type="spellEnd"/>
-      <w:r>
-        <w:t>','</w:t>
-      </w:r>
-      <w:proofErr w:type="spellStart"/>
-      <w:r>
-        <w:t>keepone</w:t>
-      </w:r>
-      <w:proofErr w:type="spellEnd"/>
-      <w:r>
-        <w:t>', 'rolling', '</w:t>
-      </w:r>
-      <w:proofErr w:type="spellStart"/>
-      <w:r>
-        <w:t>onlylowest</w:t>
-      </w:r>
-      <w:proofErr w:type="spellEnd"/>
-      <w:r>
-        <w:t>', and also (</w:t>
-      </w:r>
-      <w:proofErr w:type="spellStart"/>
-      <w:r>
-        <w:t>rs</w:t>
-      </w:r>
-      <w:proofErr w:type="spellEnd"/>
-      <w:r>
-        <w:t xml:space="preserve"> </w:t>
-      </w:r>
-      <w:proofErr w:type="gramStart"/>
-      <w:r>
-        <w:t>only) ‘</w:t>
-      </w:r>
-      <w:proofErr w:type="gramEnd"/>
-      <w:r>
-        <w:t>list’</w:t>
-      </w:r>
-    </w:p>
-    <w:p>
-      <w:proofErr w:type="spellStart"/>
-      <w:r>
-        <w:t>plotformats</w:t>
-      </w:r>
-      <w:proofErr w:type="spellEnd"/>
-      <w:r>
-        <w:t xml:space="preserve"> -&gt; [</w:t>
-      </w:r>
-      <w:proofErr w:type="spellStart"/>
-      <w:r>
-        <w:t>dim_select,coord_group_size</w:t>
-      </w:r>
-      <w:proofErr w:type="spellEnd"/>
-      <w:r>
-        <w:t>]</w:t>
-      </w:r>
-    </w:p>
-    <w:p>
-      <w:proofErr w:type="spellStart"/>
-      <w:r>
-        <w:t>connect_specs</w:t>
-      </w:r>
-      <w:proofErr w:type="spellEnd"/>
-      <w:r>
-        <w:t xml:space="preserve"> -&gt; </w:t>
-      </w:r>
-      <w:proofErr w:type="spellStart"/>
-      <w:r>
-        <w:t>connect_</w:t>
+        <w:t>s_disp_coordsets replaces functionality of psg_visualize*, which calls psg_plotcoords*.  Different strategy:  rs_disp_coordsets does not carry out any internal transformations; this should be done by rs_xform_apply or similar.</w:t>
+      </w:r>
+    </w:p>
+    <w:p>
+      <w:r>
+        <w:t>The options in psg_visualize have a correspondence to those in aux.opts_disp:</w:t>
+      </w:r>
+    </w:p>
+    <w:p>
+      <w:r>
+        <w:t>opts_vis.model_dim -&gt; dim_select</w:t>
+      </w:r>
+    </w:p>
+    <w:p>
+      <w:r>
+        <w:t>opts_vis.which_dimcombs -&gt; coord_group_method,</w:t>
+      </w:r>
+      <w:r>
+        <w:t xml:space="preserve"> and same options are available: 'all' (default),  'keeplow','keepone', 'rolling', 'onlylowest', and also (rs only) ‘list’</w:t>
+      </w:r>
+    </w:p>
+    <w:p>
+      <w:r>
+        <w:t>plotformats -&gt; [dim_select,coord_group_size]</w:t>
+      </w:r>
+    </w:p>
+    <w:p>
+      <w:r>
+        <w:lastRenderedPageBreak/>
+        <w:t>connect_specs -&gt; connect_</w:t>
       </w:r>
       <w:r>
         <w:t>sets_</w:t>
       </w:r>
-      <w:proofErr w:type="gramStart"/>
-      <w:r>
-        <w:t>method</w:t>
-      </w:r>
-      <w:proofErr w:type="spellEnd"/>
-      <w:r>
-        <w:t>; ‘</w:t>
-      </w:r>
-      <w:proofErr w:type="spellStart"/>
-      <w:proofErr w:type="gramEnd"/>
-      <w:r>
-        <w:t>none’,’star’,’circuit</w:t>
-      </w:r>
-      <w:proofErr w:type="spellEnd"/>
-      <w:r>
-        <w:t xml:space="preserve">’ available, ‘list’ to </w:t>
+      <w:r>
+        <w:t xml:space="preserve">method; ‘none’,’star’,’circuit’ available, ‘list’ to </w:t>
       </w:r>
       <w:r>
         <w:t>specify</w:t>
@@ -855,18 +394,10 @@
         <w:t>; new options:</w:t>
       </w:r>
       <w:r>
-        <w:t xml:space="preserve"> ‘</w:t>
-      </w:r>
-      <w:proofErr w:type="spellStart"/>
-      <w:r>
-        <w:t>all’</w:t>
-      </w:r>
-      <w:r>
-        <w:t>,’star_first’,’star_last’,’chain</w:t>
-      </w:r>
-      <w:proofErr w:type="spellEnd"/>
-      <w:r>
-        <w:t>’</w:t>
+        <w:t xml:space="preserve"> ‘all’</w:t>
+      </w:r>
+      <w:r>
+        <w:t>,’star_first’,’star_last’,’chain’</w:t>
       </w:r>
     </w:p>
     <w:p/>
@@ -888,44 +419,15 @@
         <w:spacing w:after="0" w:line="240" w:lineRule="auto"/>
       </w:pPr>
       <w:r>
-        <w:t>% opts=</w:t>
-      </w:r>
-      <w:proofErr w:type="spellStart"/>
-      <w:r>
-        <w:t>filldefault</w:t>
-      </w:r>
-      <w:proofErr w:type="spellEnd"/>
-      <w:r>
-        <w:t>(opts,'line_width_ring',1</w:t>
-      </w:r>
-      <w:proofErr w:type="gramStart"/>
-      <w:r>
-        <w:t>);</w:t>
-      </w:r>
-      <w:proofErr w:type="gramEnd"/>
+        <w:t>% opts=filldefault(opts,'line_width_ring',1);</w:t>
+      </w:r>
     </w:p>
     <w:p>
       <w:pPr>
         <w:spacing w:after="0" w:line="240" w:lineRule="auto"/>
       </w:pPr>
       <w:r>
-        <w:t>% opts=</w:t>
-      </w:r>
-      <w:proofErr w:type="spellStart"/>
-      <w:r>
-        <w:t>filldefault</w:t>
-      </w:r>
-      <w:proofErr w:type="spellEnd"/>
-      <w:r>
-        <w:t>(opts,'</w:t>
-      </w:r>
-      <w:proofErr w:type="spellStart"/>
-      <w:r>
-        <w:t>line_type</w:t>
-      </w:r>
-      <w:proofErr w:type="spellEnd"/>
-      <w:r>
-        <w:t>',[]); %line type</w:t>
+        <w:t>% opts=filldefault(opts,'line_type',[]); %line type</w:t>
       </w:r>
     </w:p>
     <w:p>
@@ -933,24 +435,7 @@
         <w:spacing w:after="0" w:line="240" w:lineRule="auto"/>
       </w:pPr>
       <w:r>
-        <w:lastRenderedPageBreak/>
-        <w:t>% opts=</w:t>
-      </w:r>
-      <w:proofErr w:type="spellStart"/>
-      <w:r>
-        <w:t>filldefault</w:t>
-      </w:r>
-      <w:proofErr w:type="spellEnd"/>
-      <w:r>
-        <w:t>(opts,'</w:t>
-      </w:r>
-      <w:proofErr w:type="spellStart"/>
-      <w:r>
-        <w:t>line_type_connect_neg</w:t>
-      </w:r>
-      <w:proofErr w:type="spellEnd"/>
-      <w:r>
-        <w:t>','--'); %line type for negative directions for connections</w:t>
+        <w:t>% opts=filldefault(opts,'line_type_connect_neg','--'); %line type for negative directions for connections</w:t>
       </w:r>
     </w:p>
     <w:p>
@@ -958,60 +443,15 @@
         <w:spacing w:after="0" w:line="240" w:lineRule="auto"/>
       </w:pPr>
       <w:r>
-        <w:t>% opts=</w:t>
-      </w:r>
-      <w:proofErr w:type="spellStart"/>
-      <w:r>
-        <w:t>filldefault</w:t>
-      </w:r>
-      <w:proofErr w:type="spellEnd"/>
-      <w:r>
-        <w:t>(opts,'</w:t>
-      </w:r>
-      <w:proofErr w:type="spellStart"/>
-      <w:r>
-        <w:t>line_type_ring</w:t>
-      </w:r>
-      <w:proofErr w:type="spellEnd"/>
-      <w:r>
-        <w:t>',':'</w:t>
-      </w:r>
-      <w:proofErr w:type="gramStart"/>
-      <w:r>
-        <w:t>);</w:t>
-      </w:r>
-      <w:proofErr w:type="gramEnd"/>
+        <w:t>% opts=filldefault(opts,'line_type_ring',':');</w:t>
+      </w:r>
     </w:p>
     <w:p>
       <w:pPr>
         <w:spacing w:after="0" w:line="240" w:lineRule="auto"/>
       </w:pPr>
       <w:r>
-        <w:t>% opts=</w:t>
-      </w:r>
-      <w:proofErr w:type="spellStart"/>
-      <w:r>
-        <w:t>filldefault</w:t>
-      </w:r>
-      <w:proofErr w:type="spellEnd"/>
-      <w:r>
-        <w:t>(opts,'</w:t>
-      </w:r>
-      <w:proofErr w:type="spellStart"/>
-      <w:r>
-        <w:t>marker_sign</w:t>
-      </w:r>
-      <w:proofErr w:type="spellEnd"/>
-      <w:r>
-        <w:t xml:space="preserve">','*+'); %symbols for negative and </w:t>
-      </w:r>
-      <w:proofErr w:type="spellStart"/>
-      <w:r>
-        <w:t>postive</w:t>
-      </w:r>
-      <w:proofErr w:type="spellEnd"/>
-      <w:r>
-        <w:t xml:space="preserve"> values on rays</w:t>
+        <w:t>% opts=filldefault(opts,'marker_sign','*+'); %symbols for negative and postive values on rays</w:t>
       </w:r>
     </w:p>
     <w:p>
@@ -1019,23 +459,7 @@
         <w:spacing w:after="0" w:line="240" w:lineRule="auto"/>
       </w:pPr>
       <w:r>
-        <w:t>% opts=</w:t>
-      </w:r>
-      <w:proofErr w:type="spellStart"/>
-      <w:r>
-        <w:t>filldefault</w:t>
-      </w:r>
-      <w:proofErr w:type="spellEnd"/>
-      <w:r>
-        <w:t>(</w:t>
-      </w:r>
-      <w:proofErr w:type="spellStart"/>
-      <w:r>
-        <w:t>opts,'marker_origin','o</w:t>
-      </w:r>
-      <w:proofErr w:type="spellEnd"/>
-      <w:r>
-        <w:t>'); %symbol for origin</w:t>
+        <w:t>% opts=filldefault(opts,'marker_origin','o'); %symbol for origin</w:t>
       </w:r>
     </w:p>
     <w:p>
@@ -1043,23 +467,7 @@
         <w:spacing w:after="0" w:line="240" w:lineRule="auto"/>
       </w:pPr>
       <w:r>
-        <w:t>% opts=</w:t>
-      </w:r>
-      <w:proofErr w:type="spellStart"/>
-      <w:r>
-        <w:t>filldefault</w:t>
-      </w:r>
-      <w:proofErr w:type="spellEnd"/>
-      <w:r>
-        <w:t>(opts,'</w:t>
-      </w:r>
-      <w:proofErr w:type="spellStart"/>
-      <w:r>
-        <w:t>marker_noray</w:t>
-      </w:r>
-      <w:proofErr w:type="spellEnd"/>
-      <w:r>
-        <w:t>','.'); %symbol if no ray</w:t>
+        <w:t>% opts=filldefault(opts,'marker_noray','.'); %symbol if no ray</w:t>
       </w:r>
     </w:p>
     <w:p>
@@ -1067,15 +475,7 @@
         <w:spacing w:after="0" w:line="240" w:lineRule="auto"/>
       </w:pPr>
       <w:r>
-        <w:t>% opts=</w:t>
-      </w:r>
-      <w:proofErr w:type="spellStart"/>
-      <w:r>
-        <w:t>filldefault</w:t>
-      </w:r>
-      <w:proofErr w:type="spellEnd"/>
-      <w:r>
-        <w:t>(opts,'marker_size',8); %marker size</w:t>
+        <w:t>% opts=filldefault(opts,'marker_size',8); %marker size</w:t>
       </w:r>
     </w:p>
     <w:p>
@@ -1083,28 +483,7 @@
         <w:spacing w:after="0" w:line="240" w:lineRule="auto"/>
       </w:pPr>
       <w:r>
-        <w:t>% opts=</w:t>
-      </w:r>
-      <w:proofErr w:type="spellStart"/>
-      <w:r>
-        <w:t>filldefault</w:t>
-      </w:r>
-      <w:proofErr w:type="spellEnd"/>
-      <w:r>
-        <w:t>(opts,'</w:t>
-      </w:r>
-      <w:proofErr w:type="spellStart"/>
-      <w:r>
-        <w:t>color_rays</w:t>
-      </w:r>
-      <w:proofErr w:type="spellEnd"/>
-      <w:proofErr w:type="gramStart"/>
-      <w:r>
-        <w:t>',{</w:t>
-      </w:r>
-      <w:proofErr w:type="gramEnd"/>
-      <w:r>
-        <w:t>[.3 .3 .3],[1 0 0],[0 .7 0],[0 0 1]}); %colors to cycle through for each ray, supplanted by psg_typenames2colors</w:t>
+        <w:t>% opts=filldefault(opts,'color_rays',{[.3 .3 .3],[1 0 0],[0 .7 0],[0 0 1]}); %colors to cycle through for each ray, supplanted by psg_typenames2colors</w:t>
       </w:r>
     </w:p>
     <w:p>
@@ -1112,31 +491,7 @@
         <w:spacing w:after="0" w:line="240" w:lineRule="auto"/>
       </w:pPr>
       <w:r>
-        <w:t>% opts=</w:t>
-      </w:r>
-      <w:proofErr w:type="spellStart"/>
-      <w:r>
-        <w:t>filldefault</w:t>
-      </w:r>
-      <w:proofErr w:type="spellEnd"/>
-      <w:r>
-        <w:t>(opts,'</w:t>
-      </w:r>
-      <w:proofErr w:type="spellStart"/>
-      <w:r>
-        <w:t>color_origin</w:t>
-      </w:r>
-      <w:proofErr w:type="spellEnd"/>
-      <w:r>
-        <w:t>',</w:t>
-      </w:r>
-      <w:proofErr w:type="gramStart"/>
-      <w:r>
-        <w:t xml:space="preserve">[0 </w:t>
-      </w:r>
-      <w:proofErr w:type="gramEnd"/>
-      <w:r>
-        <w:t>0 0]); %color used for origin</w:t>
+        <w:t>% opts=filldefault(opts,'color_origin',[0 0 0]); %color used for origin</w:t>
       </w:r>
     </w:p>
     <w:p>
@@ -1144,89 +499,23 @@
         <w:spacing w:after="0" w:line="240" w:lineRule="auto"/>
       </w:pPr>
       <w:r>
-        <w:t>% opts=</w:t>
-      </w:r>
-      <w:proofErr w:type="spellStart"/>
-      <w:r>
-        <w:t>filldefault</w:t>
-      </w:r>
-      <w:proofErr w:type="spellEnd"/>
-      <w:r>
-        <w:t>(opts,'</w:t>
-      </w:r>
-      <w:proofErr w:type="spellStart"/>
-      <w:r>
-        <w:t>color_nearest_nbr</w:t>
-      </w:r>
-      <w:proofErr w:type="spellEnd"/>
-      <w:r>
-        <w:t>',</w:t>
-      </w:r>
-      <w:proofErr w:type="gramStart"/>
-      <w:r>
-        <w:t xml:space="preserve">[0 </w:t>
-      </w:r>
-      <w:proofErr w:type="gramEnd"/>
-      <w:r>
-        <w:t xml:space="preserve">0 0]); %color for interconnections of nearest-neighbor points in same </w:t>
-      </w:r>
-      <w:proofErr w:type="spellStart"/>
-      <w:r>
-        <w:t>datset</w:t>
-      </w:r>
-      <w:proofErr w:type="spellEnd"/>
+        <w:t>% opts=filldefault(opts,'color_nearest_nbr',[0 0 0]); %color for interconnections of nearest-neighbor points in same datset</w:t>
+      </w:r>
     </w:p>
     <w:p>
       <w:pPr>
         <w:spacing w:after="0" w:line="240" w:lineRule="auto"/>
       </w:pPr>
       <w:r>
-        <w:t>% opts=</w:t>
-      </w:r>
-      <w:proofErr w:type="spellStart"/>
-      <w:r>
-        <w:t>filldefault</w:t>
-      </w:r>
-      <w:proofErr w:type="spellEnd"/>
-      <w:r>
-        <w:t>(opts,'</w:t>
-      </w:r>
-      <w:proofErr w:type="spellStart"/>
-      <w:r>
-        <w:t>color_ring</w:t>
-      </w:r>
-      <w:proofErr w:type="spellEnd"/>
-      <w:r>
-        <w:t>',[0 0 0]</w:t>
-      </w:r>
-      <w:proofErr w:type="gramStart"/>
-      <w:r>
-        <w:t>);</w:t>
-      </w:r>
-      <w:proofErr w:type="gramEnd"/>
+        <w:t>% opts=filldefault(opts,'color_ring',[0 0 0]);</w:t>
+      </w:r>
     </w:p>
     <w:p>
       <w:pPr>
         <w:spacing w:after="0" w:line="240" w:lineRule="auto"/>
       </w:pPr>
       <w:r>
-        <w:t>% opts=</w:t>
-      </w:r>
-      <w:proofErr w:type="spellStart"/>
-      <w:r>
-        <w:t>filldefault</w:t>
-      </w:r>
-      <w:proofErr w:type="spellEnd"/>
-      <w:r>
-        <w:t>(opts,'noray_connect',1); %connect points not on rays (ray indicator=</w:t>
-      </w:r>
-      <w:proofErr w:type="spellStart"/>
-      <w:r>
-        <w:t>NaN</w:t>
-      </w:r>
-      <w:proofErr w:type="spellEnd"/>
-      <w:r>
-        <w:t>) to each other</w:t>
+        <w:t>% opts=filldefault(opts,'noray_connect',1); %connect points not on rays (ray indicator=NaN) to each other</w:t>
       </w:r>
     </w:p>
     <w:p>
@@ -1247,39 +536,7 @@
         <w:spacing w:after="0" w:line="240" w:lineRule="auto"/>
       </w:pPr>
       <w:r>
-        <w:t xml:space="preserve">For </w:t>
-      </w:r>
-      <w:proofErr w:type="spellStart"/>
-      <w:r>
-        <w:t>rs_knit_coordsets</w:t>
-      </w:r>
-      <w:proofErr w:type="spellEnd"/>
-      <w:r>
-        <w:t xml:space="preserve">: may be helpful to allow for more dimensions in the </w:t>
-      </w:r>
-      <w:proofErr w:type="spellStart"/>
-      <w:r>
-        <w:t>mimnimization</w:t>
-      </w:r>
-      <w:proofErr w:type="spellEnd"/>
-      <w:r>
-        <w:t xml:space="preserve"> – see </w:t>
-      </w:r>
-      <w:proofErr w:type="spellStart"/>
-      <w:r>
-        <w:t>rs_toygeom_demo</w:t>
-      </w:r>
-      <w:proofErr w:type="spellEnd"/>
-      <w:r>
-        <w:t xml:space="preserve">:  </w:t>
-      </w:r>
-      <w:proofErr w:type="spellStart"/>
-      <w:r>
-        <w:t>pwaffine</w:t>
-      </w:r>
-      <w:proofErr w:type="spellEnd"/>
-      <w:r>
-        <w:t xml:space="preserve"> knitting gets “stuck” if there are no noise coordinates.</w:t>
+        <w:t>For rs_knit_coordsets: may be helpful to allow for more dimensions in the mimnimization – see rs_toygeom_demo:  pwaffine knitting gets “stuck” if there are no noise coordinates.</w:t>
       </w:r>
     </w:p>
     <w:sectPr>

</xml_diff>